<commit_message>
Capture Wix team scale, Meta Ads cert, and confirmed constraints; update DCPA application
Master profile: 2 years as Wix team lead (team of 20, then 8), Meta Ads certification,
personal-brand constraint, confirmed Section 508/WCAG gap, schedule flexibility.
DCPA resume, cover letter, and match report updated; score 69 -> 75.

Co-Authored-By: Claude Opus 5 <noreply@anthropic.com>
Claude-Session: https://claude.ai/code/session_012bgCHkXVGvrCAAv9cv5gL6
</commit_message>
<xml_diff>
--- a/applications/dcpa-associate-director-digital-marketing/Rotenberg Cover Letter - DCPA - Associate Director of Digital Marketing.docx
+++ b/applications/dcpa-associate-director-digital-marketing/Rotenberg Cover Letter - DCPA - Associate Director of Digital Marketing.docx
@@ -94,7 +94,7 @@
           <w:b w:val="0"/>
           <w:color w:val="1A1A1A"/>
         </w:rPr>
-        <w:t>I'm applying for the Associate Director of Digital Marketing role. I live in Arvada, so the on-site expectation is a short drive rather than a relocation question, and the DCPA is a landmark in a city I've worked in for most of my career.</w:t>
+        <w:t>I'm applying for the Associate Director of Digital Marketing role, and I'll say plainly that marketing for the DCPA is the job I'd want. I live in Arvada, so the on-site expectation is a short drive rather than a relocation question, and this is a landmark in a city I've worked in for most of my career.</w:t>
       </w:r>
     </w:p>
     <w:p>
@@ -120,7 +120,7 @@
           <w:b w:val="0"/>
           <w:color w:val="1A1A1A"/>
         </w:rPr>
-        <w:t>On the leadership side, I managed and developed a team of onboarding specialists at Wix, contributed to hiring and training for a brand-new vertical that went from proof of concept to a profitable business line, and built sales training used by tenured account executives. Cross-functional influence without direct authority has been most of my career, first as the person advising executives and external partners, now as a founder. I'll be straightforward that my background is B2B and agency rather than ticketed live entertainment, so revenue pacing against a show calendar would be new context, though the underlying question of whether digital activity is actually moving sales is not.</w:t>
+        <w:t>On the leadership side, I spent two years as a team lead at Wix managing onboarding specialists, a team of 20 and later a team of 8, and contributed to hiring and training for a brand-new vertical that went from proof of concept to a profitable business line, including sales training used by tenured account executives. Cross-functional influence without direct authority has been most of my career, first advising executives and external partners, now as a founder. I'll be straightforward that my background is B2B and agency rather than ticketed live entertainment, so revenue pacing against a show calendar would be new context, though the underlying question of whether digital activity is actually moving sales is not.</w:t>
       </w:r>
     </w:p>
     <w:p>

</xml_diff>

<commit_message>
Capture live-entertainment background; rework DCPA letter and application answer
Roadie work and time at the Mishawaka added to the master profile as early background.
Domain score 7 -> 9, total 75 -> 77.

Co-Authored-By: Claude Opus 5 <noreply@anthropic.com>
Claude-Session: https://claude.ai/code/session_012bgCHkXVGvrCAAv9cv5gL6
</commit_message>
<xml_diff>
--- a/applications/dcpa-associate-director-digital-marketing/Rotenberg Cover Letter - DCPA - Associate Director of Digital Marketing.docx
+++ b/applications/dcpa-associate-director-digital-marketing/Rotenberg Cover Letter - DCPA - Associate Director of Digital Marketing.docx
@@ -94,7 +94,7 @@
           <w:b w:val="0"/>
           <w:color w:val="1A1A1A"/>
         </w:rPr>
-        <w:t>I'm applying for the Associate Director of Digital Marketing role, and I'll say plainly that marketing for the DCPA is the job I'd want. I live in Arvada, so the on-site expectation is a short drive rather than a relocation question, and this is a landmark in a city I've worked in for most of my career.</w:t>
+        <w:t>I'm applying for the Associate Director of Digital Marketing role, and I'll say plainly that marketing for the DCPA is the job I'd want. Live entertainment is where I started: I worked as a roadie in college and spent time working at the Mishawaka. My career since has been B2B and agency rather than the arts, so I won't oversell that as relevant experience, but it's the reason this posting held my attention. I also live in Arvada, so the on-site expectation is a short drive rather than a relocation question.</w:t>
       </w:r>
     </w:p>
     <w:p>
@@ -120,7 +120,7 @@
           <w:b w:val="0"/>
           <w:color w:val="1A1A1A"/>
         </w:rPr>
-        <w:t>On the leadership side, I spent two years as a team lead at Wix managing onboarding specialists, a team of 20 and later a team of 8, and contributed to hiring and training for a brand-new vertical that went from proof of concept to a profitable business line, including sales training used by tenured account executives. Cross-functional influence without direct authority has been most of my career, first advising executives and external partners, now as a founder. I'll be straightforward that my background is B2B and agency rather than ticketed live entertainment, so revenue pacing against a show calendar would be new context, though the underlying question of whether digital activity is actually moving sales is not.</w:t>
+        <w:t>On the leadership side, I spent two years as a team lead at Wix managing onboarding specialists, a team of 20 and later a team of 8, and contributed to hiring and training for a brand-new vertical that went from proof of concept to a profitable business line, including sales training used by tenured account executives. Cross-functional influence without direct authority has been most of my career, first advising executives and external partners, now as a founder. Revenue pacing against a show calendar would be new context for me, though the underlying question of whether digital activity is actually moving sales is not.</w:t>
       </w:r>
     </w:p>
     <w:p>

</xml_diff>